<commit_message>
Add optional code appendix to minicourse script (Trinity/CD-HIT/BUSCO/TransDecoder)
Extrai os comandos reais de 01_quality_assembly/02_trinity_assembly.sh e
02_assembly_evaluation/03_stats_busco.sh - os dois scripts do repo com
rationale comentado por parametro, escolhidos por serem mais didaticos
que a versao crua (script-assembly.sh) ou os scripts Python de anotacao.
Cada bloco de codigo mapeia para um painel da Figura 1.
</commit_message>
<xml_diff>
--- a/roteiro-apresentacao-minicurso.docx
+++ b/roteiro-apresentacao-minicurso.docx
@@ -25,7 +25,7 @@
           <w:i/>
           <w:sz w:val="20"/>
         </w:rPr>
-        <w:t xml:space="preserve">Estudo de caso para minicurso. Bloco curto, ~15-20 minutos. Narração completa, pronta para ler/adaptar. Marcações </w:t>
+        <w:t xml:space="preserve">Estudo de caso para minicurso. Bloco curto, ~15-20 minutos (+ 3-4 min de anexo opcional com código). Narração completa, pronta para ler/adaptar. Marcações </w:t>
       </w:r>
       <w:r>
         <w:rPr>
@@ -636,6 +636,301 @@
         <w:pStyle w:val="Heading2"/>
       </w:pPr>
       <w:r>
+        <w:t>9. Anexo — os comandos por trás de cada painel (opcional, ≈ 3-4 min)</w:t>
+      </w:r>
+    </w:p>
+    <w:p>
+      <w:pPr>
+        <w:jc w:val="both"/>
+      </w:pPr>
+      <w:r>
+        <w:rPr>
+          <w:b/>
+        </w:rPr>
+        <w:t>[SLIDE: bloco de código, um por vez, seguindo a ordem da Figura 1]</w:t>
+      </w:r>
+    </w:p>
+    <w:p>
+      <w:pPr>
+        <w:ind w:left="567"/>
+      </w:pPr>
+      <w:r>
+        <w:rPr>
+          <w:i/>
+          <w:sz w:val="20"/>
+        </w:rPr>
+        <w:t xml:space="preserve">Use este bloco se a turma pedir "mas como isso roda de verdade?", ou se sobrar tempo. Os comandos vêm de </w:t>
+      </w:r>
+      <w:r>
+        <w:rPr>
+          <w:rFonts w:ascii="Courier New" w:hAnsi="Courier New"/>
+          <w:i/>
+          <w:sz w:val="20"/>
+        </w:rPr>
+        <w:t>01_quality_assembly/02_trinity_assembly.sh</w:t>
+      </w:r>
+      <w:r>
+        <w:rPr>
+          <w:i/>
+          <w:sz w:val="20"/>
+        </w:rPr>
+        <w:t xml:space="preserve"> e </w:t>
+      </w:r>
+      <w:r>
+        <w:rPr>
+          <w:rFonts w:ascii="Courier New" w:hAnsi="Courier New"/>
+          <w:i/>
+          <w:sz w:val="20"/>
+        </w:rPr>
+        <w:t>02_assembly_evaluation/03_stats_busco.sh</w:t>
+      </w:r>
+      <w:r>
+        <w:rPr>
+          <w:i/>
+          <w:sz w:val="20"/>
+        </w:rPr>
+        <w:t xml:space="preserve"> — os dois scripts do repositório escritos com comentário de rationale em cada parâmetro, pensados originalmente como material de referência. Não são os scripts que geraram os números exatos deste artigo (esses estão em </w:t>
+      </w:r>
+      <w:r>
+        <w:rPr>
+          <w:rFonts w:ascii="Courier New" w:hAnsi="Courier New"/>
+          <w:i/>
+          <w:sz w:val="20"/>
+        </w:rPr>
+        <w:t>script-assembly.sh</w:t>
+      </w:r>
+      <w:r>
+        <w:rPr>
+          <w:i/>
+          <w:sz w:val="20"/>
+        </w:rPr>
+        <w:t>, sem comentário), mas ensinam o pipeline melhor do que qualquer um dos outros.</w:t>
+      </w:r>
+    </w:p>
+    <w:p>
+      <w:pPr>
+        <w:jc w:val="both"/>
+      </w:pPr>
+      <w:r>
+        <w:t>Cada bloco de código aqui corresponde a um painel da Figura 1 que a gente já viu.</w:t>
+      </w:r>
+    </w:p>
+    <w:p>
+      <w:pPr>
+        <w:jc w:val="both"/>
+      </w:pPr>
+      <w:r>
+        <w:rPr>
+          <w:b/>
+        </w:rPr>
+        <w:t>Painel A — Trinity + CD-HIT-EST:</w:t>
+      </w:r>
+    </w:p>
+    <w:p>
+      <w:pPr>
+        <w:ind w:left="567"/>
+      </w:pPr>
+      <w:r>
+        <w:rPr>
+          <w:rFonts w:ascii="Courier New" w:hAnsi="Courier New"/>
+          <w:sz w:val="18"/>
+        </w:rPr>
+        <w:t>Trinity \</w:t>
+        <w:br/>
+        <w:t xml:space="preserve">    --seqType fq \</w:t>
+        <w:br/>
+        <w:t xml:space="preserve">    --left "${TRIMMED_R1}" --right "${TRIMMED_R2}" \</w:t>
+        <w:br/>
+        <w:t xml:space="preserve">    --SS_lib_type RF \</w:t>
+        <w:br/>
+        <w:t xml:space="preserve">    --min_kmer_cov 2 \</w:t>
+        <w:br/>
+        <w:t xml:space="preserve">    --min_contig_length 300 \</w:t>
+        <w:br/>
+        <w:t xml:space="preserve">    --jaccard_clip \</w:t>
+        <w:br/>
+        <w:t xml:space="preserve">    --max_memory 64G --CPU 16 \</w:t>
+        <w:br/>
+        <w:t xml:space="preserve">    --output "${TRINITY_OUT}"</w:t>
+        <w:br/>
+        <w:br/>
+        <w:t>cd-hit-est \</w:t>
+        <w:br/>
+        <w:t xml:space="preserve">    -i "${TRINITY_FASTA}" -o "${CDHIT_OUT}" \</w:t>
+        <w:br/>
+        <w:t xml:space="preserve">    -c 0.95 -n 8 -T 16 -M 0 -d 0</w:t>
+      </w:r>
+    </w:p>
+    <w:p>
+      <w:pPr>
+        <w:jc w:val="both"/>
+      </w:pPr>
+      <w:r>
+        <w:t xml:space="preserve">Dois pontos pra chamar atenção na hora de explicar: </w:t>
+      </w:r>
+      <w:r>
+        <w:rPr>
+          <w:rFonts w:ascii="Courier New" w:hAnsi="Courier New"/>
+          <w:sz w:val="20"/>
+        </w:rPr>
+        <w:t>--SS_lib_type RF</w:t>
+      </w:r>
+      <w:r>
+        <w:t xml:space="preserve"> diz ao Trinity que a biblioteca é </w:t>
+      </w:r>
+      <w:r>
+        <w:rPr>
+          <w:i/>
+        </w:rPr>
+        <w:t>strand-specific</w:t>
+      </w:r>
+      <w:r>
+        <w:t xml:space="preserve"> — sem isso, ele pode fundir transcritos de fita sentido e antissentido como se fossem um só. E o </w:t>
+      </w:r>
+      <w:r>
+        <w:rPr>
+          <w:rFonts w:ascii="Courier New" w:hAnsi="Courier New"/>
+          <w:sz w:val="20"/>
+        </w:rPr>
+        <w:t>-c 0.95</w:t>
+      </w:r>
+      <w:r>
+        <w:t xml:space="preserve"> do CD-HIT é exatamente o corte de 95% de identidade que colapsou aqueles 12.857 transcritos redundantes do painel A.</w:t>
+      </w:r>
+    </w:p>
+    <w:p>
+      <w:pPr>
+        <w:jc w:val="both"/>
+      </w:pPr>
+      <w:r>
+        <w:rPr>
+          <w:b/>
+        </w:rPr>
+        <w:t>Painel B — estatísticas e curva N50:</w:t>
+      </w:r>
+    </w:p>
+    <w:p>
+      <w:pPr>
+        <w:ind w:left="567"/>
+      </w:pPr>
+      <w:r>
+        <w:rPr>
+          <w:rFonts w:ascii="Courier New" w:hAnsi="Courier New"/>
+          <w:sz w:val="18"/>
+        </w:rPr>
+        <w:t>TrinityStats.pl "${CDHIT_FASTA}" | tee cdhit_stats.txt</w:t>
+      </w:r>
+    </w:p>
+    <w:p>
+      <w:pPr>
+        <w:jc w:val="both"/>
+      </w:pPr>
+      <w:r>
+        <w:t>Um comando só, mas ele que gera todos os números da curva Nx que a gente comentou — N10, N20... até N50.</w:t>
+      </w:r>
+    </w:p>
+    <w:p>
+      <w:pPr>
+        <w:jc w:val="both"/>
+      </w:pPr>
+      <w:r>
+        <w:rPr>
+          <w:b/>
+        </w:rPr>
+        <w:t>Painel C — BUSCO:</w:t>
+      </w:r>
+    </w:p>
+    <w:p>
+      <w:pPr>
+        <w:ind w:left="567"/>
+      </w:pPr>
+      <w:r>
+        <w:rPr>
+          <w:rFonts w:ascii="Courier New" w:hAnsi="Courier New"/>
+          <w:sz w:val="18"/>
+        </w:rPr>
+        <w:t>busco \</w:t>
+        <w:br/>
+        <w:t xml:space="preserve">    --input "${CDHIT_FASTA}" \</w:t>
+        <w:br/>
+        <w:t xml:space="preserve">    --out "busco_mahanarva" \</w:t>
+        <w:br/>
+        <w:t xml:space="preserve">    --lineage_dataset insecta_odb10 \</w:t>
+        <w:br/>
+        <w:t xml:space="preserve">    --mode transcriptome \</w:t>
+        <w:br/>
+        <w:t xml:space="preserve">    --cpu 16 --force</w:t>
+      </w:r>
+    </w:p>
+    <w:p>
+      <w:pPr>
+        <w:jc w:val="both"/>
+      </w:pPr>
+      <w:r>
+        <w:t>Vale ler em voz alta o comentário que está no script original sobre esse painel, porque resume bem a discussão que a gente teve sobre os 56% duplicados:</w:t>
+      </w:r>
+    </w:p>
+    <w:p>
+      <w:pPr>
+        <w:ind w:left="567"/>
+      </w:pPr>
+      <w:r>
+        <w:rPr>
+          <w:i/>
+          <w:sz w:val="20"/>
+        </w:rPr>
+        <w:t>"A salivary gland transcriptome is expected to show lower completeness than a whole-body transcriptome... isoforms may inflate duplicated BUSCOs. This is EXPECTED and does NOT indicate a low-quality assembly."</w:t>
+      </w:r>
+    </w:p>
+    <w:p>
+      <w:pPr>
+        <w:jc w:val="both"/>
+      </w:pPr>
+      <w:r>
+        <w:rPr>
+          <w:b/>
+        </w:rPr>
+        <w:t>Painel D — TransDecoder:</w:t>
+      </w:r>
+    </w:p>
+    <w:p>
+      <w:pPr>
+        <w:ind w:left="567"/>
+      </w:pPr>
+      <w:r>
+        <w:rPr>
+          <w:rFonts w:ascii="Courier New" w:hAnsi="Courier New"/>
+          <w:sz w:val="18"/>
+        </w:rPr>
+        <w:t>TransDecoder.LongOrfs -t "${CDHIT_OUT}" -m 100</w:t>
+        <w:br/>
+        <w:br/>
+        <w:t>TransDecoder.Predict -t "${CDHIT_OUT}" --single_best_only</w:t>
+      </w:r>
+    </w:p>
+    <w:p>
+      <w:pPr>
+        <w:jc w:val="both"/>
+      </w:pPr>
+      <w:r>
+        <w:rPr>
+          <w:rFonts w:ascii="Courier New" w:hAnsi="Courier New"/>
+          <w:sz w:val="20"/>
+        </w:rPr>
+        <w:t>-m 100</w:t>
+      </w:r>
+      <w:r>
+        <w:t xml:space="preserve"> é o comprimento mínimo de ORF em aminoácidos — os comentários do script justificam esse valor (em vez do padrão, que é maior) exatamente pela hipótese biológica do projeto: peptídeos secretados pequenos, como um efetor salivar, podem ser descartados por um filtro mais rígido. É um bom exemplo de como um parâmetro de bioinformática não é neutro — ele já embute uma escolha ligada à pergunta científica.</w:t>
+      </w:r>
+    </w:p>
+    <w:p>
+      <w:pPr/>
+    </w:p>
+    <w:p>
+      <w:pPr>
+        <w:pStyle w:val="Heading2"/>
+      </w:pPr>
+      <w:r>
         <w:t>Referência rápida — números usados neste roteiro</w:t>
       </w:r>
     </w:p>

</xml_diff>